<commit_message>
feat: predictive insights panel (Gemini forecasts + heuristic fallback)
Co-Authored-By: Claude Opus 4.8 <noreply@anthropic.com>
</commit_message>
<xml_diff>
--- a/docs/MuniPeople-Project-Doc.docx
+++ b/docs/MuniPeople-Project-Doc.docx
@@ -4,13 +4,13 @@
   <w:body>
     <w:p>
       <w:pPr>
-        <w:spacing w:after="40"/>
+        <w:spacing w:after="80"/>
         <w:jc w:val="center"/>
       </w:pPr>
       <w:r>
         <w:drawing>
           <wp:inline xmlns:a="http://schemas.openxmlformats.org/drawingml/2006/main" xmlns:pic="http://schemas.openxmlformats.org/drawingml/2006/picture">
-            <wp:extent cx="731520" cy="731520"/>
+            <wp:extent cx="777240" cy="777240"/>
             <wp:docPr id="1" name="Picture 1"/>
             <wp:cNvGraphicFramePr>
               <a:graphicFrameLocks noChangeAspect="1"/>
@@ -31,7 +31,7 @@
                   <pic:spPr>
                     <a:xfrm>
                       <a:off x="0" y="0"/>
-                      <a:ext cx="731520" cy="731520"/>
+                      <a:ext cx="777240" cy="777240"/>
                     </a:xfrm>
                     <a:prstGeom prst="rect"/>
                   </pic:spPr>
@@ -84,7 +84,7 @@
           <w:color w:val="5A4F45"/>
           <w:sz w:val="26"/>
         </w:rPr>
-        <w:t>AI-powered hyperlocal civic-issue reporting — see it, snap it, solve it.</w:t>
+        <w:t>AI-powered hyperlocal civic-issue reporting -- see it, snap it, solve it.</w:t>
       </w:r>
     </w:p>
     <w:p>
@@ -99,12 +99,12 @@
           <w:color w:val="8A7E70"/>
           <w:sz w:val="20"/>
         </w:rPr>
-        <w:t>Problem: Community Hero — Hyperlocal Problem Solver   ·   Powered by Google Gemini + Firebase   ·   Submission: June 29, 2026</w:t>
+        <w:t>Problem: Community Hero -- Hyperlocal Problem Solver   ·   Powered by Google Gemini + Firebase   ·   Submission: June 29, 2026</w:t>
       </w:r>
     </w:p>
     <w:p>
       <w:pPr>
-        <w:spacing w:after="200"/>
+        <w:spacing w:after="280"/>
         <w:jc w:val="center"/>
       </w:pPr>
       <w:r>
@@ -120,7 +120,6 @@
     <w:tbl>
       <w:tblPr>
         <w:tblW w:type="auto" w:w="0"/>
-        <w:jc w:val="center"/>
         <w:tblLook w:firstColumn="1" w:firstRow="1" w:lastColumn="0" w:lastRow="0" w:noHBand="0" w:noVBand="1" w:val="04A0"/>
         <w:tblBorders>
           <w:top w:val="none" w:sz="0"/>
@@ -132,12 +131,12 @@
         </w:tblBorders>
       </w:tblPr>
       <w:tblGrid>
-        <w:gridCol w:w="9648"/>
+        <w:gridCol w:w="9792"/>
       </w:tblGrid>
       <w:tr>
         <w:tc>
           <w:tcPr>
-            <w:tcW w:type="dxa" w:w="9648"/>
+            <w:tcW w:type="dxa" w:w="9792"/>
             <w:shd w:val="clear" w:fill="FBF2DC"/>
           </w:tcPr>
           <w:p>
@@ -160,7 +159,7 @@
                 <w:color w:val="5A4F45"/>
                 <w:sz w:val="22"/>
               </w:rPr>
-              <w:t>turns every citizen into a civic hero. Snap a photo of a pothole, garbage pile, broken streetlight or water leak — and an AI agent (Google Gemini) instantly understands the image, classifies the problem, judges its severity, merges duplicate reports from neighbours, drafts a formal complaint, and tracks it on a live map until the local authority fixes it. Authorities get a jurisdiction-scoped dashboard where the AI verifies the actual fix by comparing before/after photos — so “resolved” means genuinely resolved, not a rubber stamp.</w:t>
+              <w:t>MuniPeople turns every citizen into a civic hero. Snap a photo or record a short video of a pothole, garbage pile, broken streetlight or water leak -- and an AI agent (Google Gemini) instantly understands the image or video keyframe, classifies the problem, judges its severity, merges duplicate reports from neighbours, drafts a formal complaint, and tracks it on a live map until the local authority fixes it. Authorities get a jurisdiction-scoped dashboard where the AI verifies the actual fix by comparing before/after photos -- so resolved means genuinely resolved, not a rubber stamp.</w:t>
             </w:r>
           </w:p>
         </w:tc>
@@ -168,7 +167,7 @@
     </w:tbl>
     <w:p>
       <w:pPr>
-        <w:spacing w:before="360" w:after="80"/>
+        <w:spacing w:before="400" w:after="80"/>
         <w:pBdr>
           <w:bottom w:val="single" w:sz="6" w:space="4" w:color="E5DAC7"/>
         </w:pBdr>
@@ -186,7 +185,6 @@
     <w:tbl>
       <w:tblPr>
         <w:tblW w:type="auto" w:w="0"/>
-        <w:jc w:val="center"/>
         <w:tblLook w:firstColumn="1" w:firstRow="1" w:lastColumn="0" w:lastRow="0" w:noHBand="0" w:noVBand="1" w:val="04A0"/>
         <w:tblBorders>
           <w:top w:val="none" w:sz="0"/>
@@ -198,17 +196,16 @@
         </w:tblBorders>
       </w:tblPr>
       <w:tblGrid>
-        <w:gridCol w:w="2412"/>
-        <w:gridCol w:w="2412"/>
-        <w:gridCol w:w="2412"/>
-        <w:gridCol w:w="2412"/>
+        <w:gridCol w:w="2448"/>
+        <w:gridCol w:w="2448"/>
+        <w:gridCol w:w="2448"/>
+        <w:gridCol w:w="2448"/>
       </w:tblGrid>
       <w:tr>
         <w:tc>
           <w:tcPr>
-            <w:tcW w:type="dxa" w:w="2412"/>
+            <w:tcW w:type="dxa" w:w="2448"/>
             <w:shd w:val="clear" w:fill="FFFFFF"/>
-            <w:vAlign w:val="center"/>
           </w:tcPr>
           <w:p>
             <w:pPr>
@@ -220,14 +217,14 @@
                 <w:b/>
                 <w:i w:val="0"/>
                 <w:color w:val="A04E30"/>
-                <w:sz w:val="38"/>
+                <w:sz w:val="36"/>
               </w:rPr>
               <w:t>11</w:t>
             </w:r>
           </w:p>
           <w:p>
             <w:pPr>
-              <w:spacing w:after="40"/>
+              <w:spacing w:after="80"/>
               <w:jc w:val="center"/>
             </w:pPr>
             <w:r>
@@ -243,9 +240,8 @@
         </w:tc>
         <w:tc>
           <w:tcPr>
-            <w:tcW w:type="dxa" w:w="2412"/>
+            <w:tcW w:type="dxa" w:w="2448"/>
             <w:shd w:val="clear" w:fill="FFFFFF"/>
-            <w:vAlign w:val="center"/>
           </w:tcPr>
           <w:p>
             <w:pPr>
@@ -257,14 +253,14 @@
                 <w:b/>
                 <w:i w:val="0"/>
                 <w:color w:val="A04E30"/>
-                <w:sz w:val="38"/>
+                <w:sz w:val="36"/>
               </w:rPr>
               <w:t>3-layer</w:t>
             </w:r>
           </w:p>
           <w:p>
             <w:pPr>
-              <w:spacing w:after="40"/>
+              <w:spacing w:after="80"/>
               <w:jc w:val="center"/>
             </w:pPr>
             <w:r>
@@ -280,9 +276,8 @@
         </w:tc>
         <w:tc>
           <w:tcPr>
-            <w:tcW w:type="dxa" w:w="2412"/>
+            <w:tcW w:type="dxa" w:w="2448"/>
             <w:shd w:val="clear" w:fill="FFFFFF"/>
-            <w:vAlign w:val="center"/>
           </w:tcPr>
           <w:p>
             <w:pPr>
@@ -294,14 +289,14 @@
                 <w:b/>
                 <w:i w:val="0"/>
                 <w:color w:val="A04E30"/>
-                <w:sz w:val="38"/>
+                <w:sz w:val="36"/>
               </w:rPr>
               <w:t>60 m</w:t>
             </w:r>
           </w:p>
           <w:p>
             <w:pPr>
-              <w:spacing w:after="40"/>
+              <w:spacing w:after="80"/>
               <w:jc w:val="center"/>
             </w:pPr>
             <w:r>
@@ -317,9 +312,8 @@
         </w:tc>
         <w:tc>
           <w:tcPr>
-            <w:tcW w:type="dxa" w:w="2412"/>
+            <w:tcW w:type="dxa" w:w="2448"/>
             <w:shd w:val="clear" w:fill="FFFFFF"/>
-            <w:vAlign w:val="center"/>
           </w:tcPr>
           <w:p>
             <w:pPr>
@@ -331,14 +325,14 @@
                 <w:b/>
                 <w:i w:val="0"/>
                 <w:color w:val="A04E30"/>
-                <w:sz w:val="38"/>
+                <w:sz w:val="36"/>
               </w:rPr>
               <w:t>Real-time</w:t>
             </w:r>
           </w:p>
           <w:p>
             <w:pPr>
-              <w:spacing w:after="40"/>
+              <w:spacing w:after="80"/>
               <w:jc w:val="center"/>
             </w:pPr>
             <w:r>
@@ -356,9 +350,8 @@
       <w:tr>
         <w:tc>
           <w:tcPr>
-            <w:tcW w:type="dxa" w:w="2412"/>
+            <w:tcW w:type="dxa" w:w="2448"/>
             <w:shd w:val="clear" w:fill="FFFFFF"/>
-            <w:vAlign w:val="center"/>
           </w:tcPr>
           <w:p>
             <w:pPr>
@@ -370,14 +363,14 @@
                 <w:b/>
                 <w:i w:val="0"/>
                 <w:color w:val="A04E30"/>
-                <w:sz w:val="38"/>
+                <w:sz w:val="36"/>
               </w:rPr>
               <w:t>4</w:t>
             </w:r>
           </w:p>
           <w:p>
             <w:pPr>
-              <w:spacing w:after="40"/>
+              <w:spacing w:after="80"/>
               <w:jc w:val="center"/>
             </w:pPr>
             <w:r>
@@ -393,9 +386,8 @@
         </w:tc>
         <w:tc>
           <w:tcPr>
-            <w:tcW w:type="dxa" w:w="2412"/>
+            <w:tcW w:type="dxa" w:w="2448"/>
             <w:shd w:val="clear" w:fill="FFFFFF"/>
-            <w:vAlign w:val="center"/>
           </w:tcPr>
           <w:p>
             <w:pPr>
@@ -407,14 +399,14 @@
                 <w:b/>
                 <w:i w:val="0"/>
                 <w:color w:val="A04E30"/>
-                <w:sz w:val="38"/>
+                <w:sz w:val="36"/>
               </w:rPr>
-              <w:t>5</w:t>
+              <w:t>Photo + Video</w:t>
             </w:r>
           </w:p>
           <w:p>
             <w:pPr>
-              <w:spacing w:after="40"/>
+              <w:spacing w:after="80"/>
               <w:jc w:val="center"/>
             </w:pPr>
             <w:r>
@@ -424,15 +416,14 @@
                 <w:color w:val="8A7E70"/>
                 <w:sz w:val="15"/>
               </w:rPr>
-              <w:t>LIFECYCLE STATES</w:t>
+              <w:t>CAPTURE MODES</w:t>
             </w:r>
           </w:p>
         </w:tc>
         <w:tc>
           <w:tcPr>
-            <w:tcW w:type="dxa" w:w="2412"/>
+            <w:tcW w:type="dxa" w:w="2448"/>
             <w:shd w:val="clear" w:fill="FFFFFF"/>
-            <w:vAlign w:val="center"/>
           </w:tcPr>
           <w:p>
             <w:pPr>
@@ -444,14 +435,14 @@
                 <w:b/>
                 <w:i w:val="0"/>
                 <w:color w:val="A04E30"/>
-                <w:sz w:val="38"/>
+                <w:sz w:val="36"/>
               </w:rPr>
               <w:t>100%</w:t>
             </w:r>
           </w:p>
           <w:p>
             <w:pPr>
-              <w:spacing w:after="40"/>
+              <w:spacing w:after="80"/>
               <w:jc w:val="center"/>
             </w:pPr>
             <w:r>
@@ -467,9 +458,8 @@
         </w:tc>
         <w:tc>
           <w:tcPr>
-            <w:tcW w:type="dxa" w:w="2412"/>
+            <w:tcW w:type="dxa" w:w="2448"/>
             <w:shd w:val="clear" w:fill="FFFFFF"/>
-            <w:vAlign w:val="center"/>
           </w:tcPr>
           <w:p>
             <w:pPr>
@@ -481,14 +471,14 @@
                 <w:b/>
                 <w:i w:val="0"/>
                 <w:color w:val="A04E30"/>
-                <w:sz w:val="38"/>
+                <w:sz w:val="36"/>
               </w:rPr>
               <w:t>PWA</w:t>
             </w:r>
           </w:p>
           <w:p>
             <w:pPr>
-              <w:spacing w:after="40"/>
+              <w:spacing w:after="80"/>
               <w:jc w:val="center"/>
             </w:pPr>
             <w:r>
@@ -506,7 +496,7 @@
     </w:tbl>
     <w:p>
       <w:pPr>
-        <w:spacing w:before="360" w:after="80"/>
+        <w:spacing w:before="400" w:after="80"/>
         <w:pBdr>
           <w:bottom w:val="single" w:sz="6" w:space="4" w:color="E5DAC7"/>
         </w:pBdr>
@@ -523,7 +513,7 @@
     </w:p>
     <w:p>
       <w:pPr>
-        <w:spacing w:after="120"/>
+        <w:spacing w:after="80"/>
       </w:pPr>
       <w:r>
         <w:rPr>
@@ -532,7 +522,7 @@
           <w:color w:val="2B2420"/>
           <w:sz w:val="22"/>
         </w:rPr>
-        <w:t>Selected problem statement: “Community Hero — Hyperlocal Problem Solver.”</w:t>
+        <w:t>Selected: Community Hero -- Hyperlocal Problem Solver</w:t>
       </w:r>
     </w:p>
     <w:p>
@@ -546,7 +536,7 @@
           <w:color w:val="5A4F45"/>
           <w:sz w:val="22"/>
         </w:rPr>
-        <w:t>Reporting a civic issue in India today is broken: complaints get lost across siloed portals and phone lines, the same pothole gets reported fifty times with no way to merge them, authorities can't tell what's urgent from what's trivial, and citizens never find out whether anything actually happened. The feedback loop between the person who sees the problem and the office that can fix it is missing.</w:t>
+        <w:t>Reporting a civic issue in India today is broken: complaints get lost across siloed portals, the same pothole gets reported fifty times with no way to merge them, authorities can't tell what's urgent from what's trivial, and citizens never find out whether anything actually happened. The feedback loop between the person who sees the problem and the office that can fix it is missing.</w:t>
       </w:r>
     </w:p>
     <w:p>
@@ -560,12 +550,12 @@
           <w:color w:val="5A4F45"/>
           <w:sz w:val="22"/>
         </w:rPr>
-        <w:t>The hackathon brief — “Community Hero — Hyperlocal Problem Solver” — asks for a platform that lets ordinary people surface neighbourhood problems and get them solved. MuniPeople answers that with an AI agent sitting in the middle of the loop, doing the triage, deduplication, drafting and verification work that no human has time to do at city scale.</w:t>
+        <w:t>MuniPeople answers that with an AI agent sitting in the middle of the loop, doing the triage, deduplication, drafting and verification work that no human has time to do at city scale.</w:t>
       </w:r>
     </w:p>
     <w:p>
       <w:pPr>
-        <w:spacing w:before="360" w:after="80"/>
+        <w:spacing w:before="400" w:after="80"/>
         <w:pBdr>
           <w:bottom w:val="single" w:sz="6" w:space="4" w:color="E5DAC7"/>
         </w:pBdr>
@@ -591,12 +581,12 @@
           <w:color w:val="5A4F45"/>
           <w:sz w:val="22"/>
         </w:rPr>
-        <w:t>MuniPeople is a mobile-first Progressive Web App that closes the loop between citizens who spot civic problems and the authorities who fix them — with a Google Gemini AI agent doing the heavy lifting in the middle. A citizen photographs an issue; Gemini classifies it, rates its severity, and writes the report. Smart geospatial deduplication merges repeat sightings into a single crowd-weighted issue, so priority rises with public concern instead of drowning in duplicates. Reports stream live onto a severity-coded map. Pre-authorised municipal officials work a dashboard scoped strictly to their own jurisdiction, and when they claim a fix, Gemini compares the before/after photos and only permits “resolved” if the fix is real. Everything runs on Google's stack — Gemini for intelligence, Firebase for data, auth, and hosting.</w:t>
+        <w:t>MuniPeople is a mobile-first Progressive Web App that closes the loop between citizens who spot civic problems and the authorities who fix them -- with a Google Gemini AI agent doing the heavy lifting in the middle. A citizen photographs or videos an issue; Gemini classifies it from the image or an extracted keyframe, rates its severity, and writes the report. Smart geospatial deduplication merges repeat sightings into a single crowd-weighted issue, so priority rises with public concern. Reports stream live onto a severity-coded map. Pre-authorised municipal officials work a dashboard scoped strictly to their own jurisdiction, and when they claim a fix, Gemini compares before/after photos and only permits resolved if the fix is real. Everything runs on Google's stack -- Gemini for intelligence, Firebase for data, auth, and hosting.</w:t>
       </w:r>
     </w:p>
     <w:p>
       <w:pPr>
-        <w:spacing w:before="360" w:after="80"/>
+        <w:spacing w:before="400" w:after="80"/>
         <w:pBdr>
           <w:bottom w:val="single" w:sz="6" w:space="4" w:color="E5DAC7"/>
         </w:pBdr>
@@ -625,13 +615,13 @@
         </w:tblBorders>
       </w:tblPr>
       <w:tblGrid>
-        <w:gridCol w:w="4824"/>
-        <w:gridCol w:w="4824"/>
+        <w:gridCol w:w="4896"/>
+        <w:gridCol w:w="4896"/>
       </w:tblGrid>
       <w:tr>
         <w:tc>
           <w:tcPr>
-            <w:tcW w:type="dxa" w:w="4824"/>
+            <w:tcW w:type="dxa" w:w="4896"/>
             <w:shd w:val="clear" w:fill="FBF7F0"/>
           </w:tcPr>
           <w:p>
@@ -645,12 +635,12 @@
                 <w:color w:val="2B2420"/>
                 <w:sz w:val="22"/>
               </w:rPr>
-              <w:t>📸 AI photo triage</w:t>
+              <w:t>📸 Image-based reporting</w:t>
             </w:r>
           </w:p>
           <w:p>
             <w:pPr>
-              <w:spacing w:after="120"/>
+              <w:spacing w:after="160"/>
             </w:pPr>
             <w:r>
               <w:rPr>
@@ -659,13 +649,13 @@
                 <w:color w:val="5A4F45"/>
                 <w:sz w:val="19"/>
               </w:rPr>
-              <w:t>Gemini reads the photo, writes a title + description, picks one of 11 categories, and rates severity from low to critical. A selfie or non-issue is rejected at the gate.</w:t>
+              <w:t>Take a live photo or upload from device. Gemini instantly classifies category, severity, and generates a title and description.</w:t>
             </w:r>
           </w:p>
         </w:tc>
         <w:tc>
           <w:tcPr>
-            <w:tcW w:type="dxa" w:w="4824"/>
+            <w:tcW w:type="dxa" w:w="4896"/>
             <w:shd w:val="clear" w:fill="FBF7F0"/>
           </w:tcPr>
           <w:p>
@@ -679,12 +669,12 @@
                 <w:color w:val="2B2420"/>
                 <w:sz w:val="22"/>
               </w:rPr>
-              <w:t>🧠 Smart deduplication</w:t>
+              <w:t>🎥 Video-based reporting</w:t>
             </w:r>
           </w:p>
           <w:p>
             <w:pPr>
-              <w:spacing w:after="120"/>
+              <w:spacing w:after="160"/>
             </w:pPr>
             <w:r>
               <w:rPr>
@@ -693,7 +683,7 @@
                 <w:color w:val="5A4F45"/>
                 <w:sz w:val="19"/>
               </w:rPr>
-              <w:t>A new report within 60 m of an existing open issue of the same category is merged as a corroboration instead of a duplicate — crowd weight escalates priority automatically.</w:t>
+              <w:t>Record up to 8 seconds of video in-app or upload a clip. A keyframe is extracted client-side for Gemini triage; the clip plays back in detail view if it fits Firestore's doc limit.</w:t>
             </w:r>
           </w:p>
         </w:tc>
@@ -701,7 +691,7 @@
       <w:tr>
         <w:tc>
           <w:tcPr>
-            <w:tcW w:type="dxa" w:w="4824"/>
+            <w:tcW w:type="dxa" w:w="4896"/>
             <w:shd w:val="clear" w:fill="FBF7F0"/>
           </w:tcPr>
           <w:p>
@@ -715,12 +705,12 @@
                 <w:color w:val="2B2420"/>
                 <w:sz w:val="22"/>
               </w:rPr>
-              <w:t>🗺️ Live severity map</w:t>
+              <w:t>🤖 AI-powered categorisation</w:t>
             </w:r>
           </w:p>
           <w:p>
             <w:pPr>
-              <w:spacing w:after="120"/>
+              <w:spacing w:after="160"/>
             </w:pPr>
             <w:r>
               <w:rPr>
@@ -729,13 +719,13 @@
                 <w:color w:val="5A4F45"/>
                 <w:sz w:val="19"/>
               </w:rPr>
-              <w:t>Every report appears in real time on an OpenStreetMap-based map, colour-coded by severity, so the whole community and the authority see hotspots as they form.</w:t>
+              <w:t>Gemini 2.0 Flash analyses every report -- 11 categories, 4 severity tiers, civic-gate validation (selfies and non-issues are rejected). 3-layer fallback ensures zero downtime.</w:t>
             </w:r>
           </w:p>
         </w:tc>
         <w:tc>
           <w:tcPr>
-            <w:tcW w:type="dxa" w:w="4824"/>
+            <w:tcW w:type="dxa" w:w="4896"/>
             <w:shd w:val="clear" w:fill="FBF7F0"/>
           </w:tcPr>
           <w:p>
@@ -749,12 +739,12 @@
                 <w:color w:val="2B2420"/>
                 <w:sz w:val="22"/>
               </w:rPr>
-              <w:t>✍️ Auto-drafted complaints</w:t>
+              <w:t>📍 Geo-location &amp; mapping</w:t>
             </w:r>
           </w:p>
           <w:p>
             <w:pPr>
-              <w:spacing w:after="120"/>
+              <w:spacing w:after="160"/>
             </w:pPr>
             <w:r>
               <w:rPr>
@@ -763,7 +753,7 @@
                 <w:color w:val="5A4F45"/>
                 <w:sz w:val="19"/>
               </w:rPr>
-              <w:t>One tap turns an issue into a polite, formal complaint letter to the municipal authority — written by Gemini, addressed and worded correctly.</w:t>
+              <w:t>One-tap GPS with Nominatim address lookup, search-by-location, and a live Leaflet/OpenStreetMap map showing all reports colour-coded by severity.</w:t>
             </w:r>
           </w:p>
         </w:tc>
@@ -771,7 +761,7 @@
       <w:tr>
         <w:tc>
           <w:tcPr>
-            <w:tcW w:type="dxa" w:w="4824"/>
+            <w:tcW w:type="dxa" w:w="4896"/>
             <w:shd w:val="clear" w:fill="FBF7F0"/>
           </w:tcPr>
           <w:p>
@@ -785,12 +775,12 @@
                 <w:color w:val="2B2420"/>
                 <w:sz w:val="22"/>
               </w:rPr>
-              <w:t>✅ AI-gated resolution</w:t>
+              <w:t>👥 Community verification</w:t>
             </w:r>
           </w:p>
           <w:p>
             <w:pPr>
-              <w:spacing w:after="120"/>
+              <w:spacing w:after="160"/>
             </w:pPr>
             <w:r>
               <w:rPr>
@@ -799,13 +789,13 @@
                 <w:color w:val="5A4F45"/>
                 <w:sz w:val="19"/>
               </w:rPr>
-              <w:t>An authority can't just mark something done. They upload an after photo; Gemini compares it to the original and only allows resolved if the fix genuinely matches.</w:t>
+              <w:t>I see this too corroboration merges nearby duplicates and crowd-escalates priority automatically.</w:t>
             </w:r>
           </w:p>
         </w:tc>
         <w:tc>
           <w:tcPr>
-            <w:tcW w:type="dxa" w:w="4824"/>
+            <w:tcW w:type="dxa" w:w="4896"/>
             <w:shd w:val="clear" w:fill="FBF7F0"/>
           </w:tcPr>
           <w:p>
@@ -819,12 +809,12 @@
                 <w:color w:val="2B2420"/>
                 <w:sz w:val="22"/>
               </w:rPr>
-              <w:t>🏛️ Authority dashboard</w:t>
+              <w:t>🔄 Real-time issue tracking</w:t>
             </w:r>
           </w:p>
           <w:p>
             <w:pPr>
-              <w:spacing w:after="120"/>
+              <w:spacing w:after="160"/>
             </w:pPr>
             <w:r>
               <w:rPr>
@@ -833,7 +823,7 @@
                 <w:color w:val="5A4F45"/>
                 <w:sz w:val="19"/>
               </w:rPr>
-              <w:t>Pre-authorised officials get a dashboard scoped to their own city only — Mumbai never sees Karnataka's reports — sorted by severity, with acknowledge / start-work / resolve actions.</w:t>
+              <w:t>Firestore onSnapshot keeps the map and feeds live for every viewer. Status notifications sent to reporter + all corroborators at each stage.</w:t>
             </w:r>
           </w:p>
         </w:tc>
@@ -841,7 +831,7 @@
       <w:tr>
         <w:tc>
           <w:tcPr>
-            <w:tcW w:type="dxa" w:w="4824"/>
+            <w:tcW w:type="dxa" w:w="4896"/>
             <w:shd w:val="clear" w:fill="FBF7F0"/>
           </w:tcPr>
           <w:p>
@@ -855,12 +845,12 @@
                 <w:color w:val="2B2420"/>
                 <w:sz w:val="22"/>
               </w:rPr>
-              <w:t>🔔 Status notifications</w:t>
+              <w:t>📊 Impact dashboards</w:t>
             </w:r>
           </w:p>
           <w:p>
             <w:pPr>
-              <w:spacing w:after="120"/>
+              <w:spacing w:after="160"/>
             </w:pPr>
             <w:r>
               <w:rPr>
@@ -869,13 +859,13 @@
                 <w:color w:val="5A4F45"/>
                 <w:sz w:val="19"/>
               </w:rPr>
-              <w:t>Reporters and everyone who corroborated an issue get notified at each stage — acknowledged, in progress, resolved, reopened.</w:t>
+              <w:t>Animated charts: issue counts, severity breakdown, resolution rates -- refreshed in real time.</w:t>
             </w:r>
           </w:p>
         </w:tc>
         <w:tc>
           <w:tcPr>
-            <w:tcW w:type="dxa" w:w="4824"/>
+            <w:tcW w:type="dxa" w:w="4896"/>
             <w:shd w:val="clear" w:fill="FBF7F0"/>
           </w:tcPr>
           <w:p>
@@ -889,12 +879,12 @@
                 <w:color w:val="2B2420"/>
                 <w:sz w:val="22"/>
               </w:rPr>
-              <w:t>🎙️ Voice + camera + GPS</w:t>
+              <w:t>🏛️ Authority dashboard &amp; AI-gated resolution</w:t>
             </w:r>
           </w:p>
           <w:p>
             <w:pPr>
-              <w:spacing w:after="120"/>
+              <w:spacing w:after="160"/>
             </w:pPr>
             <w:r>
               <w:rPr>
@@ -903,7 +893,77 @@
                 <w:color w:val="5A4F45"/>
                 <w:sz w:val="19"/>
               </w:rPr>
-              <w:t>Web Speech API for voice notes, live camera capture, and one-tap geolocation with address search — full hyperlocal context on every report.</w:t>
+              <w:t>Jurisdiction-scoped dashboard for pre-authorised officials. Resolve is gated: Gemini must confirm the before/after photos match before marking done.</w:t>
+            </w:r>
+          </w:p>
+        </w:tc>
+      </w:tr>
+      <w:tr>
+        <w:tc>
+          <w:tcPr>
+            <w:tcW w:type="dxa" w:w="4896"/>
+            <w:shd w:val="clear" w:fill="FBF7F0"/>
+          </w:tcPr>
+          <w:p>
+            <w:pPr>
+              <w:spacing w:after="20"/>
+            </w:pPr>
+            <w:r>
+              <w:rPr>
+                <w:b/>
+                <w:i w:val="0"/>
+                <w:color w:val="2B2420"/>
+                <w:sz w:val="22"/>
+              </w:rPr>
+              <w:t>✍️ Auto-drafted formal complaints</w:t>
+            </w:r>
+          </w:p>
+          <w:p>
+            <w:pPr>
+              <w:spacing w:after="160"/>
+            </w:pPr>
+            <w:r>
+              <w:rPr>
+                <w:b w:val="0"/>
+                <w:i w:val="0"/>
+                <w:color w:val="5A4F45"/>
+                <w:sz w:val="19"/>
+              </w:rPr>
+              <w:t>One tap generates a polite, correctly addressed complaint letter to the municipal authority -- written by Gemini.</w:t>
+            </w:r>
+          </w:p>
+        </w:tc>
+        <w:tc>
+          <w:tcPr>
+            <w:tcW w:type="dxa" w:w="4896"/>
+            <w:shd w:val="clear" w:fill="FBF7F0"/>
+          </w:tcPr>
+          <w:p>
+            <w:pPr>
+              <w:spacing w:after="20"/>
+            </w:pPr>
+            <w:r>
+              <w:rPr>
+                <w:b/>
+                <w:i w:val="0"/>
+                <w:color w:val="2B2420"/>
+                <w:sz w:val="22"/>
+              </w:rPr>
+              <w:t>🎮 Gamification</w:t>
+            </w:r>
+          </w:p>
+          <w:p>
+            <w:pPr>
+              <w:spacing w:after="160"/>
+            </w:pPr>
+            <w:r>
+              <w:rPr>
+                <w:b w:val="0"/>
+                <w:i w:val="0"/>
+                <w:color w:val="5A4F45"/>
+                <w:sz w:val="19"/>
+              </w:rPr>
+              <w:t>Nagrik Score, badges, and a city-level leaderboard to reward and sustain citizen engagement.</w:t>
             </w:r>
           </w:p>
         </w:tc>
@@ -911,7 +971,7 @@
     </w:tbl>
     <w:p>
       <w:pPr>
-        <w:spacing w:before="360" w:after="80"/>
+        <w:spacing w:before="400" w:after="80"/>
         <w:pBdr>
           <w:bottom w:val="single" w:sz="6" w:space="4" w:color="E5DAC7"/>
         </w:pBdr>
@@ -923,7 +983,7 @@
           <w:color w:val="A04E30"/>
           <w:sz w:val="34"/>
         </w:rPr>
-        <w:t>How It Works — Citizen Report Flow</w:t>
+        <w:t>Citizen Report Flow (Photo &amp; Video)</w:t>
       </w:r>
     </w:p>
     <w:p>
@@ -934,7 +994,7 @@
       <w:r>
         <w:drawing>
           <wp:inline xmlns:a="http://schemas.openxmlformats.org/drawingml/2006/main" xmlns:pic="http://schemas.openxmlformats.org/drawingml/2006/picture">
-            <wp:extent cx="5943600" cy="3248247"/>
+            <wp:extent cx="5943600" cy="3488635"/>
             <wp:docPr id="2" name="Picture 2"/>
             <wp:cNvGraphicFramePr>
               <a:graphicFrameLocks noChangeAspect="1"/>
@@ -955,7 +1015,7 @@
                   <pic:spPr>
                     <a:xfrm>
                       <a:off x="0" y="0"/>
-                      <a:ext cx="5943600" cy="3248247"/>
+                      <a:ext cx="5943600" cy="3488635"/>
                     </a:xfrm>
                     <a:prstGeom prst="rect"/>
                   </pic:spPr>
@@ -968,7 +1028,7 @@
     </w:p>
     <w:p>
       <w:pPr>
-        <w:spacing w:after="200"/>
+        <w:spacing w:after="240"/>
         <w:jc w:val="center"/>
       </w:pPr>
       <w:r>
@@ -978,12 +1038,12 @@
           <w:color w:val="8A7E70"/>
           <w:sz w:val="18"/>
         </w:rPr>
-        <w:t>Figure 1 — From snapshot to live, deduplicated, mapped issue in a single AI-driven pipeline.</w:t>
+        <w:t>Figure 1 -- Photo or video → AI keyframe triage → dedup → live map in one pipeline.</w:t>
       </w:r>
     </w:p>
     <w:p>
       <w:pPr>
-        <w:spacing w:before="360" w:after="80"/>
+        <w:spacing w:before="400" w:after="80"/>
         <w:pBdr>
           <w:bottom w:val="single" w:sz="6" w:space="4" w:color="E5DAC7"/>
         </w:pBdr>
@@ -1040,7 +1100,7 @@
     </w:p>
     <w:p>
       <w:pPr>
-        <w:spacing w:after="200"/>
+        <w:spacing w:after="240"/>
         <w:jc w:val="center"/>
       </w:pPr>
       <w:r>
@@ -1050,12 +1110,12 @@
           <w:color w:val="8A7E70"/>
           <w:sz w:val="18"/>
         </w:rPr>
-        <w:t>Figure 2 — “Resolved” is earned: the AI must confirm the fix before the status can change.</w:t>
+        <w:t>Figure 2 -- Resolved is earned: Gemini must confirm the fix before the status changes.</w:t>
       </w:r>
     </w:p>
     <w:p>
       <w:pPr>
-        <w:spacing w:before="360" w:after="80"/>
+        <w:spacing w:before="400" w:after="80"/>
         <w:pBdr>
           <w:bottom w:val="single" w:sz="6" w:space="4" w:color="E5DAC7"/>
         </w:pBdr>
@@ -1067,7 +1127,7 @@
           <w:color w:val="A04E30"/>
           <w:sz w:val="34"/>
         </w:rPr>
-        <w:t>AI Reliability — 3-Layer Fallback Chain</w:t>
+        <w:t>AI Reliability -- 3-Layer Fallback Chain</w:t>
       </w:r>
     </w:p>
     <w:p>
@@ -1081,7 +1141,7 @@
           <w:color w:val="5A4F45"/>
           <w:sz w:val="22"/>
         </w:rPr>
-        <w:t>The AI never hard-fails the user. Every classification and verification call flows through a graceful cascade: primary Google model first, a free vision model as backup, and a deterministic heuristic as a last resort — so a rate-limit or outage degrades quality, never availability.</w:t>
+        <w:t>The AI never hard-fails the user. Every call flows through a graceful cascade -- so a rate-limit or outage degrades quality, never availability.</w:t>
       </w:r>
     </w:p>
     <w:p>
@@ -1126,7 +1186,7 @@
     </w:p>
     <w:p>
       <w:pPr>
-        <w:spacing w:after="200"/>
+        <w:spacing w:after="240"/>
         <w:jc w:val="center"/>
       </w:pPr>
       <w:r>
@@ -1136,12 +1196,12 @@
           <w:color w:val="8A7E70"/>
           <w:sz w:val="18"/>
         </w:rPr>
-        <w:t>Figure 3 — Google Gemini leads; Groq and a heuristic guarantee the app stays up.</w:t>
+        <w:t>Figure 3 -- Gemini leads; Groq and a heuristic stub guarantee the app stays functional.</w:t>
       </w:r>
     </w:p>
     <w:p>
       <w:pPr>
-        <w:spacing w:before="360" w:after="80"/>
+        <w:spacing w:before="400" w:after="80"/>
         <w:pBdr>
           <w:bottom w:val="single" w:sz="6" w:space="4" w:color="E5DAC7"/>
         </w:pBdr>
@@ -1198,7 +1258,7 @@
     </w:p>
     <w:p>
       <w:pPr>
-        <w:spacing w:after="200"/>
+        <w:spacing w:after="240"/>
         <w:jc w:val="center"/>
       </w:pPr>
       <w:r>
@@ -1208,12 +1268,12 @@
           <w:color w:val="8A7E70"/>
           <w:sz w:val="18"/>
         </w:rPr>
-        <w:t>Figure 4 — A client-only architecture: the browser talks directly to Google's managed services.</w:t>
+        <w:t>Figure 4 -- Client-only; the browser talks directly to Google-managed services.</w:t>
       </w:r>
     </w:p>
     <w:p>
       <w:pPr>
-        <w:spacing w:before="360" w:after="80"/>
+        <w:spacing w:before="400" w:after="80"/>
         <w:pBdr>
           <w:bottom w:val="single" w:sz="6" w:space="4" w:color="E5DAC7"/>
         </w:pBdr>
@@ -1235,13 +1295,13 @@
         <w:tblLook w:firstColumn="1" w:firstRow="1" w:lastColumn="0" w:lastRow="0" w:noHBand="0" w:noVBand="1" w:val="04A0"/>
       </w:tblPr>
       <w:tblGrid>
-        <w:gridCol w:w="2304"/>
-        <w:gridCol w:w="4824"/>
+        <w:gridCol w:w="2448"/>
+        <w:gridCol w:w="4896"/>
       </w:tblGrid>
       <w:tr>
         <w:tc>
           <w:tcPr>
-            <w:tcW w:type="dxa" w:w="4824"/>
+            <w:tcW w:type="dxa" w:w="4896"/>
             <w:shd w:val="clear" w:fill="EFE6D6"/>
           </w:tcPr>
           <w:p>
@@ -1261,7 +1321,7 @@
         </w:tc>
         <w:tc>
           <w:tcPr>
-            <w:tcW w:type="dxa" w:w="4824"/>
+            <w:tcW w:type="dxa" w:w="4896"/>
           </w:tcPr>
           <w:p>
             <w:pPr>
@@ -1274,7 +1334,7 @@
                 <w:color w:val="5A4F45"/>
                 <w:sz w:val="19"/>
               </w:rPr>
-              <w:t>title, description, category, severity, status, location{lat,lng,city,address}, imageData, afterImageData, reportCount, corroborators[], fixVerified, fixNote, reporterId</w:t>
+              <w:t>title, description, category, severity, status, location{lat,lng,city,address}, imageData, afterImageData, mediaType, videoData, reportCount, corroborators[], fixVerified, fixNote, reporterId</w:t>
             </w:r>
           </w:p>
         </w:tc>
@@ -1282,7 +1342,7 @@
       <w:tr>
         <w:tc>
           <w:tcPr>
-            <w:tcW w:type="dxa" w:w="4824"/>
+            <w:tcW w:type="dxa" w:w="4896"/>
             <w:shd w:val="clear" w:fill="EFE6D6"/>
           </w:tcPr>
           <w:p>
@@ -1302,7 +1362,7 @@
         </w:tc>
         <w:tc>
           <w:tcPr>
-            <w:tcW w:type="dxa" w:w="4824"/>
+            <w:tcW w:type="dxa" w:w="4896"/>
           </w:tcPr>
           <w:p>
             <w:pPr>
@@ -1315,7 +1375,7 @@
                 <w:color w:val="5A4F45"/>
                 <w:sz w:val="19"/>
               </w:rPr>
-              <w:t>displayName, email, role (citizen / authority), jurisdiction, points, badges — owner-write only</w:t>
+              <w:t>displayName, email, role (citizen / authority), jurisdiction, points, badges -- owner-write only</w:t>
             </w:r>
           </w:p>
         </w:tc>
@@ -1323,7 +1383,7 @@
       <w:tr>
         <w:tc>
           <w:tcPr>
-            <w:tcW w:type="dxa" w:w="4824"/>
+            <w:tcW w:type="dxa" w:w="4896"/>
             <w:shd w:val="clear" w:fill="EFE6D6"/>
           </w:tcPr>
           <w:p>
@@ -1343,7 +1403,7 @@
         </w:tc>
         <w:tc>
           <w:tcPr>
-            <w:tcW w:type="dxa" w:w="4824"/>
+            <w:tcW w:type="dxa" w:w="4896"/>
           </w:tcPr>
           <w:p>
             <w:pPr>
@@ -1356,7 +1416,7 @@
                 <w:color w:val="5A4F45"/>
                 <w:sz w:val="19"/>
               </w:rPr>
-              <w:t>userId, issueId, title, status, read, createdAt — owner-read only; created on every status change</w:t>
+              <w:t>userId, issueId, title, status, read, createdAt -- owner-read; created on every status change</w:t>
             </w:r>
           </w:p>
         </w:tc>
@@ -1364,7 +1424,7 @@
       <w:tr>
         <w:tc>
           <w:tcPr>
-            <w:tcW w:type="dxa" w:w="4824"/>
+            <w:tcW w:type="dxa" w:w="4896"/>
             <w:shd w:val="clear" w:fill="EFE6D6"/>
           </w:tcPr>
           <w:p>
@@ -1384,7 +1444,7 @@
         </w:tc>
         <w:tc>
           <w:tcPr>
-            <w:tcW w:type="dxa" w:w="4824"/>
+            <w:tcW w:type="dxa" w:w="4896"/>
           </w:tcPr>
           <w:p>
             <w:pPr>
@@ -1397,7 +1457,7 @@
                 <w:color w:val="5A4F45"/>
                 <w:sz w:val="19"/>
               </w:rPr>
-              <w:t>Issues: public read, auth-only write, delete blocked. Users: owner-write. Notifications: owner-read, delete blocked. Authority access gated by a pre-approved email allow-list.</w:t>
+              <w:t>Issues: public read, auth-only write, delete blocked. Users: owner-write. Notifications: owner-read, delete blocked. Authority gated by pre-approved email allow-list.</w:t>
             </w:r>
           </w:p>
         </w:tc>
@@ -1405,7 +1465,7 @@
     </w:tbl>
     <w:p>
       <w:pPr>
-        <w:spacing w:before="360" w:after="80"/>
+        <w:spacing w:before="400" w:after="80"/>
         <w:pBdr>
           <w:bottom w:val="single" w:sz="6" w:space="4" w:color="E5DAC7"/>
         </w:pBdr>
@@ -1462,7 +1522,7 @@
     </w:p>
     <w:p>
       <w:pPr>
-        <w:spacing w:after="200"/>
+        <w:spacing w:after="240"/>
         <w:jc w:val="center"/>
       </w:pPr>
       <w:r>
@@ -1472,7 +1532,7 @@
           <w:color w:val="8A7E70"/>
           <w:sz w:val="18"/>
         </w:rPr>
-        <w:t>Figure 5 — The more neighbours corroborate an issue, the higher the AI escalates its priority.</w:t>
+        <w:t>Figure 5 -- The more neighbours corroborate an issue, the higher the AI escalates its priority.</w:t>
       </w:r>
     </w:p>
     <w:p>
@@ -1495,7 +1555,7 @@
           <w:color w:val="5A4F45"/>
           <w:sz w:val="21"/>
         </w:rPr>
-        <w:t xml:space="preserve">pothole · garbage · streetlight · water leakage · drainage · sewage · road damage · fallen tree · stray animals · public toilet · other.   </w:t>
+        <w:t xml:space="preserve">pothole · garbage · streetlight · water leakage · drainage · sewage · road damage · fallen tree · stray animals · public toilet · other.  </w:t>
       </w:r>
       <w:r>
         <w:rPr>
@@ -1518,7 +1578,7 @@
     </w:p>
     <w:p>
       <w:pPr>
-        <w:spacing w:before="360" w:after="80"/>
+        <w:spacing w:before="400" w:after="80"/>
         <w:pBdr>
           <w:bottom w:val="single" w:sz="6" w:space="4" w:color="E5DAC7"/>
         </w:pBdr>
@@ -1559,7 +1619,7 @@
           <w:color w:val="2B2420"/>
           <w:sz w:val="21"/>
         </w:rPr>
-        <w:t>Google Gemini 2.0 Flash — via Google AI Studio</w:t>
+        <w:t>Google Gemini 2.0 Flash -- via Google AI Studio (image triage, complaint drafting, fix verification)</w:t>
       </w:r>
     </w:p>
     <w:p>
@@ -1574,7 +1634,7 @@
           <w:color w:val="2B2420"/>
           <w:sz w:val="21"/>
         </w:rPr>
-        <w:t>Firebase Firestore (real-time database)</w:t>
+        <w:t>Firebase Firestore -- real-time database (onSnapshot live sync)</w:t>
       </w:r>
     </w:p>
     <w:p>
@@ -1589,7 +1649,7 @@
           <w:color w:val="2B2420"/>
           <w:sz w:val="21"/>
         </w:rPr>
-        <w:t>Firebase Authentication (Google / Email / Anonymous)</w:t>
+        <w:t>Firebase Authentication -- Google Sign-In / Email / Anonymous</w:t>
       </w:r>
     </w:p>
     <w:p>
@@ -1604,7 +1664,7 @@
           <w:color w:val="2B2420"/>
           <w:sz w:val="21"/>
         </w:rPr>
-        <w:t>Firebase Hosting (live deployment)</w:t>
+        <w:t>Firebase Hosting -- live deployment on Google Cloud CDN</w:t>
       </w:r>
     </w:p>
     <w:p>
@@ -1618,7 +1678,7 @@
           <w:color w:val="C2613D"/>
           <w:sz w:val="25"/>
         </w:rPr>
-        <w:t>Frontend &amp; supporting</w:t>
+        <w:t>Additional technologies</w:t>
       </w:r>
     </w:p>
     <w:p>
@@ -1632,12 +1692,12 @@
           <w:color w:val="5A4F45"/>
           <w:sz w:val="21"/>
         </w:rPr>
-        <w:t>React 19 · TypeScript · Vite (rolldown) · React Router · Leaflet + OpenStreetMap · Web Speech API · getUserMedia (camera) · Nominatim geocoding · PWA (manifest + service worker) · canvas-confetti · Groq Llama-4 (AI fallback).</w:t>
+        <w:t>React 19 · TypeScript · Vite (rolldown) · React Router · Leaflet + OpenStreetMap · Web Speech API · getUserMedia (camera + MediaRecorder for video) · Nominatim geocoding · PWA (manifest + service worker) · canvas-confetti · Groq Llama-4 (AI fallback, open-source)</w:t>
       </w:r>
     </w:p>
     <w:p>
       <w:pPr>
-        <w:spacing w:before="360" w:after="80"/>
+        <w:spacing w:before="400" w:after="80"/>
         <w:pBdr>
           <w:bottom w:val="single" w:sz="6" w:space="4" w:color="E5DAC7"/>
         </w:pBdr>
@@ -1663,7 +1723,7 @@
           <w:color w:val="5A4F45"/>
           <w:sz w:val="22"/>
         </w:rPr>
-        <w:t>MuniPeople is built to meet the VIBE2SHIP General Guidelines in full:</w:t>
+        <w:t>MuniPeople satisfies every mandatory VIBE2SHIP General Guideline:</w:t>
       </w:r>
     </w:p>
     <w:tbl>
@@ -1681,12 +1741,12 @@
       </w:tblPr>
       <w:tblGrid>
         <w:gridCol w:w="576"/>
-        <w:gridCol w:w="4824"/>
+        <w:gridCol w:w="4896"/>
       </w:tblGrid>
       <w:tr>
         <w:tc>
           <w:tcPr>
-            <w:tcW w:type="dxa" w:w="4824"/>
+            <w:tcW w:type="dxa" w:w="4896"/>
           </w:tcPr>
           <w:p>
             <w:pPr>
@@ -1705,11 +1765,11 @@
         </w:tc>
         <w:tc>
           <w:tcPr>
-            <w:tcW w:type="dxa" w:w="4824"/>
+            <w:tcW w:type="dxa" w:w="4896"/>
           </w:tcPr>
           <w:p>
             <w:pPr>
-              <w:spacing w:after="120"/>
+              <w:spacing w:after="140"/>
             </w:pPr>
             <w:r>
               <w:rPr>
@@ -1718,7 +1778,7 @@
                 <w:color w:val="2B2420"/>
                 <w:sz w:val="21"/>
               </w:rPr>
-              <w:t xml:space="preserve">Eligibility — solo project.  </w:t>
+              <w:t xml:space="preserve">Eligibility -- solo project.  </w:t>
             </w:r>
             <w:r>
               <w:rPr>
@@ -1727,7 +1787,7 @@
                 <w:color w:val="5A4F45"/>
                 <w:sz w:val="21"/>
               </w:rPr>
-              <w:t>MuniPeople is the original, individual work of a single participant, registered before the deadline. No team involvement.</w:t>
+              <w:t>Original, individual work of a single participant, registered before the June 21 2026 deadline. No team involvement.</w:t>
             </w:r>
           </w:p>
         </w:tc>
@@ -1735,7 +1795,7 @@
       <w:tr>
         <w:tc>
           <w:tcPr>
-            <w:tcW w:type="dxa" w:w="4824"/>
+            <w:tcW w:type="dxa" w:w="4896"/>
           </w:tcPr>
           <w:p>
             <w:pPr>
@@ -1754,11 +1814,11 @@
         </w:tc>
         <w:tc>
           <w:tcPr>
-            <w:tcW w:type="dxa" w:w="4824"/>
+            <w:tcW w:type="dxa" w:w="4896"/>
           </w:tcPr>
           <w:p>
             <w:pPr>
-              <w:spacing w:after="120"/>
+              <w:spacing w:after="140"/>
             </w:pPr>
             <w:r>
               <w:rPr>
@@ -1767,7 +1827,7 @@
                 <w:color w:val="2B2420"/>
                 <w:sz w:val="21"/>
               </w:rPr>
-              <w:t xml:space="preserve">Mandatory tool — Google AI Studio.  </w:t>
+              <w:t xml:space="preserve">Mandatory tool -- Google AI Studio.  </w:t>
             </w:r>
             <w:r>
               <w:rPr>
@@ -1776,7 +1836,7 @@
                 <w:color w:val="5A4F45"/>
                 <w:sz w:val="21"/>
               </w:rPr>
-              <w:t>The product's intelligence is powered by Google Gemini, accessed through Google AI Studio (model gemini-2.0-flash via the @google/genai SDK). Gemini drives image triage, complaint drafting, and before/after fix verification — it is the core of the solution, not an add-on.</w:t>
+              <w:t>Powered by Google Gemini (gemini-2.0-flash via @google/genai SDK, accessed through Google AI Studio). Gemini drives image + video keyframe triage, complaint drafting, and before/after fix verification -- it is the core of the solution, not an add-on.</w:t>
             </w:r>
           </w:p>
         </w:tc>
@@ -1784,7 +1844,7 @@
       <w:tr>
         <w:tc>
           <w:tcPr>
-            <w:tcW w:type="dxa" w:w="4824"/>
+            <w:tcW w:type="dxa" w:w="4896"/>
           </w:tcPr>
           <w:p>
             <w:pPr>
@@ -1803,11 +1863,11 @@
         </w:tc>
         <w:tc>
           <w:tcPr>
-            <w:tcW w:type="dxa" w:w="4824"/>
+            <w:tcW w:type="dxa" w:w="4896"/>
           </w:tcPr>
           <w:p>
             <w:pPr>
-              <w:spacing w:after="120"/>
+              <w:spacing w:after="140"/>
             </w:pPr>
             <w:r>
               <w:rPr>
@@ -1825,7 +1885,7 @@
                 <w:color w:val="5A4F45"/>
                 <w:sz w:val="21"/>
               </w:rPr>
-              <w:t>All application code is original. Third-party building blocks — React, Firebase, Leaflet/OpenStreetMap, Nominatim, Groq, canvas-confetti — are open-source or publicly available APIs, used per their licenses and credited here and in the repository.</w:t>
+              <w:t>All application code is original. Third-party libraries (React, Firebase, Leaflet, Nominatim, Groq, canvas-confetti) are open-source, used per their licenses, and credited here and in the repository.</w:t>
             </w:r>
           </w:p>
         </w:tc>
@@ -1833,7 +1893,7 @@
       <w:tr>
         <w:tc>
           <w:tcPr>
-            <w:tcW w:type="dxa" w:w="4824"/>
+            <w:tcW w:type="dxa" w:w="4896"/>
           </w:tcPr>
           <w:p>
             <w:pPr>
@@ -1852,11 +1912,11 @@
         </w:tc>
         <w:tc>
           <w:tcPr>
-            <w:tcW w:type="dxa" w:w="4824"/>
+            <w:tcW w:type="dxa" w:w="4896"/>
           </w:tcPr>
           <w:p>
             <w:pPr>
-              <w:spacing w:after="120"/>
+              <w:spacing w:after="140"/>
             </w:pPr>
             <w:r>
               <w:rPr>
@@ -1874,7 +1934,7 @@
                 <w:color w:val="5A4F45"/>
                 <w:sz w:val="21"/>
               </w:rPr>
-              <w:t>Built from scratch for this hackathon; not a resubmission of a prior project. Source history is available for originality checks.</w:t>
+              <w:t>Built from scratch for this hackathon. Not a resubmission of a prior project. Full Git history available for originality checks.</w:t>
             </w:r>
           </w:p>
         </w:tc>
@@ -1882,7 +1942,7 @@
       <w:tr>
         <w:tc>
           <w:tcPr>
-            <w:tcW w:type="dxa" w:w="4824"/>
+            <w:tcW w:type="dxa" w:w="4896"/>
           </w:tcPr>
           <w:p>
             <w:pPr>
@@ -1901,11 +1961,11 @@
         </w:tc>
         <w:tc>
           <w:tcPr>
-            <w:tcW w:type="dxa" w:w="4824"/>
+            <w:tcW w:type="dxa" w:w="4896"/>
           </w:tcPr>
           <w:p>
             <w:pPr>
-              <w:spacing w:after="120"/>
+              <w:spacing w:after="140"/>
             </w:pPr>
             <w:r>
               <w:rPr>
@@ -1914,7 +1974,7 @@
                 <w:color w:val="2B2420"/>
                 <w:sz w:val="21"/>
               </w:rPr>
-              <w:t xml:space="preserve">Additional tech.  </w:t>
+              <w:t xml:space="preserve">Additional tech permitted.  </w:t>
             </w:r>
             <w:r>
               <w:rPr>
@@ -1923,7 +1983,7 @@
                 <w:color w:val="5A4F45"/>
                 <w:sz w:val="21"/>
               </w:rPr>
-              <w:t>Supplementary tools beyond Google AI Studio are used as permitted by the problem statement, with Google technologies remaining central.</w:t>
+              <w:t>Supplementary tools are used as allowed by the problem statement; Google technologies remain central throughout.</w:t>
             </w:r>
           </w:p>
         </w:tc>
@@ -1943,12 +2003,12 @@
         </w:tblBorders>
       </w:tblPr>
       <w:tblGrid>
-        <w:gridCol w:w="9648"/>
+        <w:gridCol w:w="9792"/>
       </w:tblGrid>
       <w:tr>
         <w:tc>
           <w:tcPr>
-            <w:tcW w:type="dxa" w:w="9648"/>
+            <w:tcW w:type="dxa" w:w="9792"/>
             <w:shd w:val="clear" w:fill="FBF2DC"/>
           </w:tcPr>
           <w:p>
@@ -1968,7 +2028,7 @@
                 <w:color w:val="5A4F45"/>
                 <w:sz w:val="21"/>
               </w:rPr>
-              <w:t>Beyond the mandatory Google AI Studio requirement, the entire backend and AI layer runs on Google's stack — Gemini for intelligence and Firebase for data, auth, and hosting — maximising the use-of-Google-technology scoring criterion.</w:t>
+              <w:t>Beyond the mandatory Google AI Studio requirement, the entire backend and AI layer runs on Google's stack -- Gemini for intelligence + Firebase for data, auth, and hosting -- maximising the use-of-Google-technology scoring criterion.</w:t>
             </w:r>
           </w:p>
         </w:tc>
@@ -1976,7 +2036,7 @@
     </w:tbl>
     <w:p>
       <w:pPr>
-        <w:spacing w:before="360" w:after="80"/>
+        <w:spacing w:before="400" w:after="80"/>
         <w:pBdr>
           <w:bottom w:val="single" w:sz="6" w:space="4" w:color="E5DAC7"/>
         </w:pBdr>
@@ -1999,12 +2059,12 @@
       </w:tblPr>
       <w:tblGrid>
         <w:gridCol w:w="2736"/>
-        <w:gridCol w:w="4824"/>
+        <w:gridCol w:w="4896"/>
       </w:tblGrid>
       <w:tr>
         <w:tc>
           <w:tcPr>
-            <w:tcW w:type="dxa" w:w="4824"/>
+            <w:tcW w:type="dxa" w:w="4896"/>
             <w:shd w:val="clear" w:fill="2B2420"/>
           </w:tcPr>
           <w:p>
@@ -2021,7 +2081,7 @@
         </w:tc>
         <w:tc>
           <w:tcPr>
-            <w:tcW w:type="dxa" w:w="4824"/>
+            <w:tcW w:type="dxa" w:w="4896"/>
             <w:shd w:val="clear" w:fill="2B2420"/>
           </w:tcPr>
           <w:p>
@@ -2040,7 +2100,7 @@
       <w:tr>
         <w:tc>
           <w:tcPr>
-            <w:tcW w:type="dxa" w:w="4824"/>
+            <w:tcW w:type="dxa" w:w="4896"/>
           </w:tcPr>
           <w:p>
             <w:r>
@@ -2056,7 +2116,7 @@
         </w:tc>
         <w:tc>
           <w:tcPr>
-            <w:tcW w:type="dxa" w:w="4824"/>
+            <w:tcW w:type="dxa" w:w="4896"/>
           </w:tcPr>
           <w:p>
             <w:r>
@@ -2074,7 +2134,7 @@
       <w:tr>
         <w:tc>
           <w:tcPr>
-            <w:tcW w:type="dxa" w:w="4824"/>
+            <w:tcW w:type="dxa" w:w="4896"/>
           </w:tcPr>
           <w:p>
             <w:r>
@@ -2090,7 +2150,7 @@
         </w:tc>
         <w:tc>
           <w:tcPr>
-            <w:tcW w:type="dxa" w:w="4824"/>
+            <w:tcW w:type="dxa" w:w="4896"/>
           </w:tcPr>
           <w:p>
             <w:r>
@@ -2108,7 +2168,7 @@
       <w:tr>
         <w:tc>
           <w:tcPr>
-            <w:tcW w:type="dxa" w:w="4824"/>
+            <w:tcW w:type="dxa" w:w="4896"/>
           </w:tcPr>
           <w:p>
             <w:r>
@@ -2124,7 +2184,7 @@
         </w:tc>
         <w:tc>
           <w:tcPr>
-            <w:tcW w:type="dxa" w:w="4824"/>
+            <w:tcW w:type="dxa" w:w="4896"/>
           </w:tcPr>
           <w:p>
             <w:r>
@@ -2134,7 +2194,7 @@
                 <w:color w:val="5A4F45"/>
                 <w:sz w:val="20"/>
               </w:rPr>
-              <w:t>Community Hero — Hyperlocal Problem Solver</w:t>
+              <w:t>Community Hero -- Hyperlocal Problem Solver</w:t>
             </w:r>
           </w:p>
         </w:tc>
@@ -2142,7 +2202,7 @@
       <w:tr>
         <w:tc>
           <w:tcPr>
-            <w:tcW w:type="dxa" w:w="4824"/>
+            <w:tcW w:type="dxa" w:w="4896"/>
           </w:tcPr>
           <w:p>
             <w:r>
@@ -2158,7 +2218,7 @@
         </w:tc>
         <w:tc>
           <w:tcPr>
-            <w:tcW w:type="dxa" w:w="4824"/>
+            <w:tcW w:type="dxa" w:w="4896"/>
           </w:tcPr>
           <w:p>
             <w:r>
@@ -2176,7 +2236,7 @@
       <w:tr>
         <w:tc>
           <w:tcPr>
-            <w:tcW w:type="dxa" w:w="4824"/>
+            <w:tcW w:type="dxa" w:w="4896"/>
           </w:tcPr>
           <w:p>
             <w:r>
@@ -2192,7 +2252,7 @@
         </w:tc>
         <w:tc>
           <w:tcPr>
-            <w:tcW w:type="dxa" w:w="4824"/>
+            <w:tcW w:type="dxa" w:w="4896"/>
           </w:tcPr>
           <w:p>
             <w:r>
@@ -2203,6 +2263,40 @@
                 <w:sz w:val="20"/>
               </w:rPr>
               <w:t>Firebase (Firestore · Auth · Hosting)</w:t>
+            </w:r>
+          </w:p>
+        </w:tc>
+      </w:tr>
+      <w:tr>
+        <w:tc>
+          <w:tcPr>
+            <w:tcW w:type="dxa" w:w="4896"/>
+          </w:tcPr>
+          <w:p>
+            <w:r>
+              <w:rPr>
+                <w:b/>
+                <w:i w:val="0"/>
+                <w:color w:val="2B2420"/>
+                <w:sz w:val="20"/>
+              </w:rPr>
+              <w:t>Source code</w:t>
+            </w:r>
+          </w:p>
+        </w:tc>
+        <w:tc>
+          <w:tcPr>
+            <w:tcW w:type="dxa" w:w="4896"/>
+          </w:tcPr>
+          <w:p>
+            <w:r>
+              <w:rPr>
+                <w:b w:val="0"/>
+                <w:i w:val="0"/>
+                <w:color w:val="5A4F45"/>
+                <w:sz w:val="20"/>
+              </w:rPr>
+              <w:t>https://github.com/AdityaDevShi/Junk</w:t>
             </w:r>
           </w:p>
         </w:tc>
@@ -2225,7 +2319,7 @@
     <w:p>
       <w:pPr>
         <w:pStyle w:val="ListBullet"/>
-        <w:spacing w:after="20"/>
+        <w:spacing w:after="40"/>
       </w:pPr>
       <w:r>
         <w:rPr>
@@ -2234,13 +2328,13 @@
           <w:color w:val="5A4F45"/>
           <w:sz w:val="21"/>
         </w:rPr>
-        <w:t>Open the live link on your phone → sign in (Google / email / anonymous).</w:t>
+        <w:t>Open https://junkcivicsense.web.app on your phone → sign in (Google / email / anonymous).</w:t>
       </w:r>
     </w:p>
     <w:p>
       <w:pPr>
         <w:pStyle w:val="ListBullet"/>
-        <w:spacing w:after="20"/>
+        <w:spacing w:after="40"/>
       </w:pPr>
       <w:r>
         <w:rPr>
@@ -2249,13 +2343,13 @@
           <w:color w:val="5A4F45"/>
           <w:sz w:val="21"/>
         </w:rPr>
-        <w:t>Tap Report → snap a photo of any civic issue → watch Gemini classify it instantly.</w:t>
+        <w:t>Tap Report → take a photo OR record a short video of any civic issue.</w:t>
       </w:r>
     </w:p>
     <w:p>
       <w:pPr>
         <w:pStyle w:val="ListBullet"/>
-        <w:spacing w:after="20"/>
+        <w:spacing w:after="40"/>
       </w:pPr>
       <w:r>
         <w:rPr>
@@ -2264,13 +2358,13 @@
           <w:color w:val="5A4F45"/>
           <w:sz w:val="21"/>
         </w:rPr>
-        <w:t>See it appear on the live map, colour-coded by severity.</w:t>
+        <w:t>Watch Gemini classify it instantly, then see it appear on the live map.</w:t>
       </w:r>
     </w:p>
     <w:p>
       <w:pPr>
         <w:pStyle w:val="ListBullet"/>
-        <w:spacing w:after="20"/>
+        <w:spacing w:after="40"/>
       </w:pPr>
       <w:r>
         <w:rPr>
@@ -2279,12 +2373,12 @@
           <w:color w:val="5A4F45"/>
           <w:sz w:val="21"/>
         </w:rPr>
-        <w:t>Sign in as the pre-authorised authority → resolve it with an after photo → watch the AI verify the fix.</w:t>
+        <w:t>Sign in as the pre-authorised authority → resolve it with an after photo → AI verifies the fix.</w:t>
       </w:r>
     </w:p>
     <w:p>
       <w:pPr>
-        <w:spacing w:after="120" w:before="400"/>
+        <w:spacing w:after="120" w:before="480"/>
         <w:jc w:val="center"/>
       </w:pPr>
       <w:r>
@@ -2294,12 +2388,12 @@
           <w:color w:val="8A7E70"/>
           <w:sz w:val="17"/>
         </w:rPr>
-        <w:t>MuniPeople · Built for VIBE2SHIP (Coding Ninjas × Google for Developers) · Powered by Google Gemini &amp; Firebase · Generated June 28, 2026</w:t>
+        <w:t>MuniPeople · Built for VIBE2SHIP (Coding Ninjas × Google for Developers) · Powered by Google Gemini &amp; Firebase · June 2026</w:t>
       </w:r>
     </w:p>
     <w:sectPr>
       <w:pgSz w:w="12240" w:h="15840"/>
-      <w:pgMar w:top="1008" w:right="1296" w:bottom="1008" w:left="1296" w:header="720" w:footer="720" w:gutter="0"/>
+      <w:pgMar w:top="1008" w:right="1224" w:bottom="1008" w:left="1224" w:header="720" w:footer="720" w:gutter="0"/>
       <w:cols w:space="720"/>
       <w:docGrid w:linePitch="360"/>
     </w:sectPr>

</xml_diff>